<commit_message>
Añade diagramas al documento de análisis
</commit_message>
<xml_diff>
--- a/docs/documento_analisis.docx
+++ b/docs/documento_analisis.docx
@@ -1240,6 +1240,11 @@
       </w:tr>
     </w:tbl>
     <w:p>
+      <w:r>
+        <w:br w:type="page"/>
+      </w:r>
+    </w:p>
+    <w:p>
       <w:pPr>
         <w:spacing w:before="280" w:after="120"/>
       </w:pPr>
@@ -1250,7 +1255,316 @@
           <w:color w:val="1F3A8A"/>
           <w:sz w:val="36"/>
         </w:rPr>
-        <w:t>6. Alcance de la solución</w:t>
+        <w:t>6. Diseño del sistema</w:t>
+      </w:r>
+    </w:p>
+    <w:p>
+      <w:pPr>
+        <w:spacing w:after="80"/>
+      </w:pPr>
+      <w:r>
+        <w:rPr>
+          <w:rFonts w:ascii="Arial" w:hAnsi="Arial"/>
+          <w:b w:val="0"/>
+          <w:i w:val="0"/>
+          <w:sz w:val="22"/>
+        </w:rPr>
+        <w:t>Esta sección documenta el diseño del sistema mediante cuatro vistas complementarias: casos de uso (qué hace cada actor), flujo de proceso (cómo se procesa una lectura), modelo de base de datos (cómo se almacenan los datos en MongoDB) y mockups (cómo se ve la interfaz de usuario).</w:t>
+      </w:r>
+    </w:p>
+    <w:p>
+      <w:pPr>
+        <w:spacing w:before="280" w:after="120"/>
+      </w:pPr>
+      <w:r>
+        <w:rPr>
+          <w:rFonts w:ascii="Arial" w:hAnsi="Arial"/>
+          <w:b/>
+          <w:color w:val="1F3A8A"/>
+          <w:sz w:val="28"/>
+        </w:rPr>
+        <w:t>6.1 Diagrama de casos de uso</w:t>
+      </w:r>
+    </w:p>
+    <w:p>
+      <w:pPr>
+        <w:spacing w:after="80"/>
+        <w:jc w:val="center"/>
+      </w:pPr>
+      <w:r>
+        <w:drawing>
+          <wp:inline xmlns:a="http://schemas.openxmlformats.org/drawingml/2006/main" xmlns:pic="http://schemas.openxmlformats.org/drawingml/2006/picture">
+            <wp:extent cx="5760720" cy="3584448"/>
+            <wp:docPr id="1" name="Picture 1"/>
+            <wp:cNvGraphicFramePr>
+              <a:graphicFrameLocks noChangeAspect="1"/>
+            </wp:cNvGraphicFramePr>
+            <a:graphic>
+              <a:graphicData uri="http://schemas.openxmlformats.org/drawingml/2006/picture">
+                <pic:pic>
+                  <pic:nvPicPr>
+                    <pic:cNvPr id="0" name="casos_de_uso.png"/>
+                    <pic:cNvPicPr/>
+                  </pic:nvPicPr>
+                  <pic:blipFill>
+                    <a:blip r:embed="rId9"/>
+                    <a:stretch>
+                      <a:fillRect/>
+                    </a:stretch>
+                  </pic:blipFill>
+                  <pic:spPr>
+                    <a:xfrm>
+                      <a:off x="0" y="0"/>
+                      <a:ext cx="5760720" cy="3584448"/>
+                    </a:xfrm>
+                    <a:prstGeom prst="rect"/>
+                  </pic:spPr>
+                </pic:pic>
+              </a:graphicData>
+            </a:graphic>
+          </wp:inline>
+        </w:drawing>
+      </w:r>
+    </w:p>
+    <w:p>
+      <w:pPr>
+        <w:spacing w:after="240"/>
+        <w:jc w:val="center"/>
+      </w:pPr>
+      <w:r>
+        <w:rPr>
+          <w:rFonts w:ascii="Arial" w:hAnsi="Arial"/>
+          <w:i/>
+          <w:color w:val="64748B"/>
+          <w:sz w:val="18"/>
+        </w:rPr>
+        <w:t>Figura 1. Casos de uso del sistema con los actores Operador, Administrador y Auditor.</w:t>
+      </w:r>
+    </w:p>
+    <w:p>
+      <w:pPr>
+        <w:spacing w:before="280" w:after="120"/>
+      </w:pPr>
+      <w:r>
+        <w:rPr>
+          <w:rFonts w:ascii="Arial" w:hAnsi="Arial"/>
+          <w:b/>
+          <w:color w:val="1F3A8A"/>
+          <w:sz w:val="28"/>
+        </w:rPr>
+        <w:t>6.2 Diagrama de flujo del proceso</w:t>
+      </w:r>
+    </w:p>
+    <w:p>
+      <w:pPr>
+        <w:spacing w:after="80"/>
+        <w:jc w:val="center"/>
+      </w:pPr>
+      <w:r>
+        <w:drawing>
+          <wp:inline xmlns:a="http://schemas.openxmlformats.org/drawingml/2006/main" xmlns:pic="http://schemas.openxmlformats.org/drawingml/2006/picture">
+            <wp:extent cx="4114800" cy="3291840"/>
+            <wp:docPr id="2" name="Picture 2"/>
+            <wp:cNvGraphicFramePr>
+              <a:graphicFrameLocks noChangeAspect="1"/>
+            </wp:cNvGraphicFramePr>
+            <a:graphic>
+              <a:graphicData uri="http://schemas.openxmlformats.org/drawingml/2006/picture">
+                <pic:pic>
+                  <pic:nvPicPr>
+                    <pic:cNvPr id="0" name="flujo_proceso.png"/>
+                    <pic:cNvPicPr/>
+                  </pic:nvPicPr>
+                  <pic:blipFill>
+                    <a:blip r:embed="rId10"/>
+                    <a:stretch>
+                      <a:fillRect/>
+                    </a:stretch>
+                  </pic:blipFill>
+                  <pic:spPr>
+                    <a:xfrm>
+                      <a:off x="0" y="0"/>
+                      <a:ext cx="4114800" cy="3291840"/>
+                    </a:xfrm>
+                    <a:prstGeom prst="rect"/>
+                  </pic:spPr>
+                </pic:pic>
+              </a:graphicData>
+            </a:graphic>
+          </wp:inline>
+        </w:drawing>
+      </w:r>
+    </w:p>
+    <w:p>
+      <w:pPr>
+        <w:spacing w:after="240"/>
+        <w:jc w:val="center"/>
+      </w:pPr>
+      <w:r>
+        <w:rPr>
+          <w:rFonts w:ascii="Arial" w:hAnsi="Arial"/>
+          <w:i/>
+          <w:color w:val="64748B"/>
+          <w:sz w:val="18"/>
+        </w:rPr>
+        <w:t>Figura 2. Flujo desde la captura de una lectura hasta la generación del reporte imprimible.</w:t>
+      </w:r>
+    </w:p>
+    <w:p>
+      <w:pPr>
+        <w:spacing w:before="280" w:after="120"/>
+      </w:pPr>
+      <w:r>
+        <w:rPr>
+          <w:rFonts w:ascii="Arial" w:hAnsi="Arial"/>
+          <w:b/>
+          <w:color w:val="1F3A8A"/>
+          <w:sz w:val="28"/>
+        </w:rPr>
+        <w:t>6.3 Modelo de base de datos (MongoDB)</w:t>
+      </w:r>
+    </w:p>
+    <w:p>
+      <w:pPr>
+        <w:spacing w:after="80"/>
+        <w:jc w:val="center"/>
+      </w:pPr>
+      <w:r>
+        <w:drawing>
+          <wp:inline xmlns:a="http://schemas.openxmlformats.org/drawingml/2006/main" xmlns:pic="http://schemas.openxmlformats.org/drawingml/2006/picture">
+            <wp:extent cx="5760720" cy="3802075"/>
+            <wp:docPr id="3" name="Picture 3"/>
+            <wp:cNvGraphicFramePr>
+              <a:graphicFrameLocks noChangeAspect="1"/>
+            </wp:cNvGraphicFramePr>
+            <a:graphic>
+              <a:graphicData uri="http://schemas.openxmlformats.org/drawingml/2006/picture">
+                <pic:pic>
+                  <pic:nvPicPr>
+                    <pic:cNvPr id="0" name="modelo_bd.png"/>
+                    <pic:cNvPicPr/>
+                  </pic:nvPicPr>
+                  <pic:blipFill>
+                    <a:blip r:embed="rId11"/>
+                    <a:stretch>
+                      <a:fillRect/>
+                    </a:stretch>
+                  </pic:blipFill>
+                  <pic:spPr>
+                    <a:xfrm>
+                      <a:off x="0" y="0"/>
+                      <a:ext cx="5760720" cy="3802075"/>
+                    </a:xfrm>
+                    <a:prstGeom prst="rect"/>
+                  </pic:spPr>
+                </pic:pic>
+              </a:graphicData>
+            </a:graphic>
+          </wp:inline>
+        </w:drawing>
+      </w:r>
+    </w:p>
+    <w:p>
+      <w:pPr>
+        <w:spacing w:after="240"/>
+        <w:jc w:val="center"/>
+      </w:pPr>
+      <w:r>
+        <w:rPr>
+          <w:rFonts w:ascii="Arial" w:hAnsi="Arial"/>
+          <w:i/>
+          <w:color w:val="64748B"/>
+          <w:sz w:val="18"/>
+        </w:rPr>
+        <w:t>Figura 3. Colecciones de MongoDB y relación lógica entre lecturas y alertas.</w:t>
+      </w:r>
+    </w:p>
+    <w:p>
+      <w:pPr>
+        <w:spacing w:before="280" w:after="120"/>
+      </w:pPr>
+      <w:r>
+        <w:rPr>
+          <w:rFonts w:ascii="Arial" w:hAnsi="Arial"/>
+          <w:b/>
+          <w:color w:val="1F3A8A"/>
+          <w:sz w:val="28"/>
+        </w:rPr>
+        <w:t>6.4 Mockups de la interfaz</w:t>
+      </w:r>
+    </w:p>
+    <w:p>
+      <w:pPr>
+        <w:spacing w:after="80"/>
+        <w:jc w:val="center"/>
+      </w:pPr>
+      <w:r>
+        <w:drawing>
+          <wp:inline xmlns:a="http://schemas.openxmlformats.org/drawingml/2006/main" xmlns:pic="http://schemas.openxmlformats.org/drawingml/2006/picture">
+            <wp:extent cx="5760720" cy="2658794"/>
+            <wp:docPr id="4" name="Picture 4"/>
+            <wp:cNvGraphicFramePr>
+              <a:graphicFrameLocks noChangeAspect="1"/>
+            </wp:cNvGraphicFramePr>
+            <a:graphic>
+              <a:graphicData uri="http://schemas.openxmlformats.org/drawingml/2006/picture">
+                <pic:pic>
+                  <pic:nvPicPr>
+                    <pic:cNvPr id="0" name="mockups.png"/>
+                    <pic:cNvPicPr/>
+                  </pic:nvPicPr>
+                  <pic:blipFill>
+                    <a:blip r:embed="rId12"/>
+                    <a:stretch>
+                      <a:fillRect/>
+                    </a:stretch>
+                  </pic:blipFill>
+                  <pic:spPr>
+                    <a:xfrm>
+                      <a:off x="0" y="0"/>
+                      <a:ext cx="5760720" cy="2658794"/>
+                    </a:xfrm>
+                    <a:prstGeom prst="rect"/>
+                  </pic:spPr>
+                </pic:pic>
+              </a:graphicData>
+            </a:graphic>
+          </wp:inline>
+        </w:drawing>
+      </w:r>
+    </w:p>
+    <w:p>
+      <w:pPr>
+        <w:spacing w:after="240"/>
+        <w:jc w:val="center"/>
+      </w:pPr>
+      <w:r>
+        <w:rPr>
+          <w:rFonts w:ascii="Arial" w:hAnsi="Arial"/>
+          <w:i/>
+          <w:color w:val="64748B"/>
+          <w:sz w:val="18"/>
+        </w:rPr>
+        <w:t>Figura 4. Mockups de las tres pantallas principales: Login, Dashboard y Reporte imprimible.</w:t>
+      </w:r>
+    </w:p>
+    <w:p>
+      <w:r>
+        <w:br w:type="page"/>
+      </w:r>
+    </w:p>
+    <w:p>
+      <w:pPr>
+        <w:spacing w:before="280" w:after="120"/>
+      </w:pPr>
+      <w:r>
+        <w:rPr>
+          <w:rFonts w:ascii="Arial" w:hAnsi="Arial"/>
+          <w:b/>
+          <w:color w:val="1F3A8A"/>
+          <w:sz w:val="36"/>
+        </w:rPr>
+        <w:t>7. Alcance de la solución</w:t>
       </w:r>
     </w:p>
     <w:p>
@@ -1278,7 +1592,7 @@
           <w:color w:val="1F3A8A"/>
           <w:sz w:val="36"/>
         </w:rPr>
-        <w:t>7. Tecnologías propuestas</w:t>
+        <w:t>8. Tecnologías propuestas</w:t>
       </w:r>
     </w:p>
     <w:p>

</xml_diff>